<commit_message>
Audience data request: trim to what only the team can supply
- Skip titles, thumbnails, segment timestamps and bibles (we have them)
- Retention for every live show since 3/18, API preferred; screenshot
  fallback spread across show types, not best/worst; live vs replay check
- Title/thumbnail changes after publish now MUST; Shorts section removed
- Leave revenue out; Facebook post type now MUST
- Section 3 asks for corrections to our draft episode map + FB URLs,
  plus Matt's teardown sheet

Co-Authored-By: Claude Opus 5.5 <noreply@anthropic.com>
Claude-Session: https://claude.ai/code/session_01VmRatYBunsoj9i1F4m2msf
</commit_message>
<xml_diff>
--- a/docs/Rossen Audience Data Request.docx
+++ b/docs/Rossen Audience Data Request.docx
@@ -377,7 +377,7 @@
           <w:sz w:val="21"/>
           <w:szCs w:val="21"/>
         </w:rPr>
-        <w:t xml:space="preserve">the last 12 months for exports. If that's too much, the last 30 episodes.</w:t>
+        <w:t xml:space="preserve">the last 12 months for exports. If that's too much, every live show since March 18, 2026.</w:t>
       </w:r>
     </w:p>
     <w:p>
@@ -407,7 +407,37 @@
           <w:sz w:val="21"/>
           <w:szCs w:val="21"/>
         </w:rPr>
-        <w:t xml:space="preserve">live streams, premieres/uploads, and Shorts/Reels. Their numbers aren't comparable.</w:t>
+        <w:t xml:space="preserve">live streams and regular uploads. Their numbers aren't comparable.</w:t>
+      </w:r>
+    </w:p>
+    <w:p>
+      <w:pPr>
+        <w:pStyle w:val="ListParagraph"/>
+        <w:numPr>
+          <w:ilvl w:val="0"/>
+          <w:numId w:val="2"/>
+        </w:numPr>
+        <w:spacing w:after="60"/>
+      </w:pPr>
+      <w:r>
+        <w:rPr>
+          <w:rFonts w:ascii="Arial" w:cs="Arial" w:eastAsia="Arial" w:hAnsi="Arial"/>
+          <w:b/>
+          <w:bCs/>
+          <w:color w:val="1F2933"/>
+          <w:sz w:val="21"/>
+          <w:szCs w:val="21"/>
+        </w:rPr>
+        <w:t xml:space="preserve">Leave out revenue. </w:t>
+      </w:r>
+      <w:r>
+        <w:rPr>
+          <w:rFonts w:ascii="Arial" w:cs="Arial" w:eastAsia="Arial" w:hAnsi="Arial"/>
+          <w:color w:val="1F2933"/>
+          <w:sz w:val="21"/>
+          <w:szCs w:val="21"/>
+        </w:rPr>
+        <w:t xml:space="preserve">Remove estimated revenue, RPM and CPM columns before sending. We only need audience numbers.</w:t>
       </w:r>
     </w:p>
     <w:p>
@@ -438,6 +468,31 @@
           <w:szCs w:val="21"/>
         </w:rPr>
         <w:t xml:space="preserve">If you'd rather grant access than export, see "Ongoing access" at the end.</w:t>
+      </w:r>
+    </w:p>
+    <w:p>
+      <w:pPr>
+        <w:spacing w:after="120" w:before="100"/>
+      </w:pPr>
+      <w:r>
+        <w:rPr>
+          <w:rFonts w:ascii="Arial" w:cs="Arial" w:eastAsia="Arial" w:hAnsi="Arial"/>
+          <w:b/>
+          <w:bCs/>
+          <w:color w:val="1F2933"/>
+          <w:sz w:val="21"/>
+          <w:szCs w:val="21"/>
+        </w:rPr>
+        <w:t xml:space="preserve">What we already have, so please skip it: </w:t>
+      </w:r>
+      <w:r>
+        <w:rPr>
+          <w:rFonts w:ascii="Arial" w:cs="Arial" w:eastAsia="Arial" w:hAnsi="Arial"/>
+          <w:color w:val="1F2933"/>
+          <w:sz w:val="21"/>
+          <w:szCs w:val="21"/>
+        </w:rPr>
+        <w:t xml:space="preserve">final titles, current thumbnails, show transcripts, and the bibles. We'll build the segment timestamps from the transcripts and send you a draft episode map to correct (section 3).</w:t>
       </w:r>
     </w:p>
     <w:p>
@@ -1443,7 +1498,7 @@
                 <w:sz w:val="18"/>
                 <w:szCs w:val="18"/>
               </w:rPr>
-              <w:t xml:space="preserve">Audience retention graph for each of the last 30 long-form episodes</w:t>
+              <w:t xml:space="preserve">Audience retention graph for every live show since March 18. Not needed if we get API access (section 4). If screenshots are the only option, 20 shows spread across Wednesday, Friday, F2 and call-in, and across high and low views (not just the best and worst)</w:t>
             </w:r>
           </w:p>
         </w:tc>
@@ -1581,7 +1636,7 @@
                 <w:sz w:val="18"/>
                 <w:szCs w:val="18"/>
               </w:rPr>
-              <w:t xml:space="preserve">"Key moments" panel for the same videos (intro, top moments, spikes, dips)</w:t>
+              <w:t xml:space="preserve">"Key moments" panel for the same videos (intro, top moments, spikes, dips). Needed even with API access: it gives the exact share still watching at 0:30</w:t>
             </w:r>
           </w:p>
         </w:tc>
@@ -1721,7 +1776,7 @@
                 <w:sz w:val="18"/>
                 <w:szCs w:val="18"/>
               </w:rPr>
-              <w:t xml:space="preserve">Relative retention (vs similar-length videos), if shown</w:t>
+              <w:t xml:space="preserve">For 3 live shows: the retention graph twice, once filtered to "On demand" and once to "Live &amp; on demand" (tells us whether the graph counts live viewers)</w:t>
             </w:r>
           </w:p>
         </w:tc>
@@ -1754,7 +1809,7 @@
                 <w:sz w:val="18"/>
                 <w:szCs w:val="18"/>
               </w:rPr>
-              <w:t xml:space="preserve">Same screen</w:t>
+              <w:t xml:space="preserve">Same screen → the view-type filter at the top</w:t>
             </w:r>
           </w:p>
         </w:tc>
@@ -1859,7 +1914,7 @@
                 <w:sz w:val="18"/>
                 <w:szCs w:val="18"/>
               </w:rPr>
-              <w:t xml:space="preserve">The final edited timestamps per episode: when each story, clip, guest, sponsor read and deals segment starts</w:t>
+              <w:t xml:space="preserve">Relative retention (vs similar-length videos), if shown</w:t>
             </w:r>
           </w:p>
         </w:tc>
@@ -1893,7 +1948,7 @@
                 <w:sz w:val="18"/>
                 <w:szCs w:val="18"/>
               </w:rPr>
-              <w:t xml:space="preserve">From the editor's timeline, the YouTube chapters, or the rundown</w:t>
+              <w:t xml:space="preserve">Same screen</w:t>
             </w:r>
           </w:p>
         </w:tc>
@@ -1927,7 +1982,7 @@
                 <w:sz w:val="18"/>
                 <w:szCs w:val="18"/>
               </w:rPr>
-              <w:t xml:space="preserve">Sheet: episode, segment, start time</w:t>
+              <w:t xml:space="preserve">Screenshot</w:t>
             </w:r>
           </w:p>
         </w:tc>
@@ -1961,7 +2016,7 @@
                 <w:sz w:val="18"/>
                 <w:szCs w:val="18"/>
               </w:rPr>
-              <w:t xml:space="preserve">MUST</w:t>
+              <w:t xml:space="preserve">HIGH</w:t>
             </w:r>
           </w:p>
         </w:tc>
@@ -1980,7 +2035,7 @@
           <w:sz w:val="21"/>
           <w:szCs w:val="21"/>
         </w:rPr>
-        <w:t xml:space="preserve">Why the timestamps matter: </w:t>
+        <w:t xml:space="preserve">How we'll use it: </w:t>
       </w:r>
       <w:r>
         <w:rPr>
@@ -1989,7 +2044,7 @@
           <w:sz w:val="21"/>
           <w:szCs w:val="21"/>
         </w:rPr>
-        <w:t xml:space="preserve">they let us line each retention dip up against the exact bible line. Without them the graph shows where people leave but not what made them leave.</w:t>
+        <w:t xml:space="preserve">we line each retention dip up against our timestamped transcript of the show, so we can see what was on screen when viewers left.</w:t>
       </w:r>
     </w:p>
     <w:p>
@@ -2006,7 +2061,21 @@
           <w:sz w:val="24"/>
           <w:szCs w:val="24"/>
         </w:rPr>
-        <w:t xml:space="preserve">1C. Packaging: titles, thumbnails, descriptions</w:t>
+        <w:t xml:space="preserve">1C. Packaging: titles and thumbnails</w:t>
+      </w:r>
+    </w:p>
+    <w:p>
+      <w:pPr>
+        <w:spacing w:after="120" w:before="100"/>
+      </w:pPr>
+      <w:r>
+        <w:rPr>
+          <w:rFonts w:ascii="Arial" w:cs="Arial" w:eastAsia="Arial" w:hAnsi="Arial"/>
+          <w:color w:val="1F2933"/>
+          <w:sz w:val="21"/>
+          <w:szCs w:val="21"/>
+        </w:rPr>
+        <w:t xml:space="preserve">We already have the current titles and thumbnails. What we can't see is what changed.</w:t>
       </w:r>
     </w:p>
     <w:tbl>
@@ -2201,7 +2270,7 @@
                 <w:sz w:val="18"/>
                 <w:szCs w:val="18"/>
               </w:rPr>
-              <w:t xml:space="preserve">Final title, description and chapters for each episode</w:t>
+              <w:t xml:space="preserve">Any title or thumbnail changes after publish, with dates and the earlier version</w:t>
             </w:r>
           </w:p>
         </w:tc>
@@ -2234,7 +2303,7 @@
                 <w:sz w:val="18"/>
                 <w:szCs w:val="18"/>
               </w:rPr>
-              <w:t xml:space="preserve">Studio → Content → each video (or the per-video export if it includes titles)</w:t>
+              <w:t xml:space="preserve">Team memory / change log / design files</w:t>
             </w:r>
           </w:p>
         </w:tc>
@@ -2267,7 +2336,7 @@
                 <w:sz w:val="18"/>
                 <w:szCs w:val="18"/>
               </w:rPr>
-              <w:t xml:space="preserve">Sheet</w:t>
+              <w:t xml:space="preserve">Sheet + image files</w:t>
             </w:r>
           </w:p>
         </w:tc>
@@ -2301,284 +2370,6 @@
                 <w:szCs w:val="18"/>
               </w:rPr>
               <w:t xml:space="preserve">MUST</w:t>
-            </w:r>
-          </w:p>
-        </w:tc>
-      </w:tr>
-      <w:tr>
-        <w:trPr>
-          <w:cantSplit/>
-        </w:trPr>
-        <w:tc>
-          <w:tcPr>
-            <w:tcW w:type="dxa" w:w="3000"/>
-            <w:tcBorders>
-              <w:top w:val="single" w:color="D1D5DB" w:sz="4"/>
-              <w:left w:val="single" w:color="D1D5DB" w:sz="4"/>
-              <w:bottom w:val="single" w:color="D1D5DB" w:sz="4"/>
-              <w:right w:val="single" w:color="D1D5DB" w:sz="4"/>
-            </w:tcBorders>
-            <w:shd w:fill="F3F4F6" w:color="auto" w:val="clear"/>
-            <w:tcMar>
-              <w:top w:type="dxa" w:w="70"/>
-              <w:left w:type="dxa" w:w="100"/>
-              <w:bottom w:type="dxa" w:w="70"/>
-              <w:right w:type="dxa" w:w="100"/>
-            </w:tcMar>
-          </w:tcPr>
-          <w:p>
-            <w:pPr>
-              <w:spacing w:after="30"/>
-            </w:pPr>
-            <w:r>
-              <w:rPr>
-                <w:rFonts w:ascii="Arial" w:cs="Arial" w:eastAsia="Arial" w:hAnsi="Arial"/>
-                <w:b w:val="false"/>
-                <w:bCs w:val="false"/>
-                <w:color w:val="1F2933"/>
-                <w:sz w:val="18"/>
-                <w:szCs w:val="18"/>
-              </w:rPr>
-              <w:t xml:space="preserve">The thumbnail image each episode ran with</w:t>
-            </w:r>
-          </w:p>
-        </w:tc>
-        <w:tc>
-          <w:tcPr>
-            <w:tcW w:type="dxa" w:w="2900"/>
-            <w:tcBorders>
-              <w:top w:val="single" w:color="D1D5DB" w:sz="4"/>
-              <w:left w:val="single" w:color="D1D5DB" w:sz="4"/>
-              <w:bottom w:val="single" w:color="D1D5DB" w:sz="4"/>
-              <w:right w:val="single" w:color="D1D5DB" w:sz="4"/>
-            </w:tcBorders>
-            <w:shd w:fill="F3F4F6" w:color="auto" w:val="clear"/>
-            <w:tcMar>
-              <w:top w:type="dxa" w:w="70"/>
-              <w:left w:type="dxa" w:w="100"/>
-              <w:bottom w:type="dxa" w:w="70"/>
-              <w:right w:type="dxa" w:w="100"/>
-            </w:tcMar>
-          </w:tcPr>
-          <w:p>
-            <w:pPr>
-              <w:spacing w:after="30"/>
-            </w:pPr>
-            <w:r>
-              <w:rPr>
-                <w:rFonts w:ascii="Arial" w:cs="Arial" w:eastAsia="Arial" w:hAnsi="Arial"/>
-                <w:b w:val="false"/>
-                <w:bCs w:val="false"/>
-                <w:color w:val="1F2933"/>
-                <w:sz w:val="18"/>
-                <w:szCs w:val="18"/>
-              </w:rPr>
-              <w:t xml:space="preserve">Studio → Content → each video → download thumbnail</w:t>
-            </w:r>
-          </w:p>
-        </w:tc>
-        <w:tc>
-          <w:tcPr>
-            <w:tcW w:type="dxa" w:w="2560"/>
-            <w:tcBorders>
-              <w:top w:val="single" w:color="D1D5DB" w:sz="4"/>
-              <w:left w:val="single" w:color="D1D5DB" w:sz="4"/>
-              <w:bottom w:val="single" w:color="D1D5DB" w:sz="4"/>
-              <w:right w:val="single" w:color="D1D5DB" w:sz="4"/>
-            </w:tcBorders>
-            <w:shd w:fill="F3F4F6" w:color="auto" w:val="clear"/>
-            <w:tcMar>
-              <w:top w:type="dxa" w:w="70"/>
-              <w:left w:type="dxa" w:w="100"/>
-              <w:bottom w:type="dxa" w:w="70"/>
-              <w:right w:type="dxa" w:w="100"/>
-            </w:tcMar>
-          </w:tcPr>
-          <w:p>
-            <w:pPr>
-              <w:spacing w:after="30"/>
-            </w:pPr>
-            <w:r>
-              <w:rPr>
-                <w:rFonts w:ascii="Arial" w:cs="Arial" w:eastAsia="Arial" w:hAnsi="Arial"/>
-                <w:b w:val="false"/>
-                <w:bCs w:val="false"/>
-                <w:color w:val="1F2933"/>
-                <w:sz w:val="18"/>
-                <w:szCs w:val="18"/>
-              </w:rPr>
-              <w:t xml:space="preserve">Image files named by date</w:t>
-            </w:r>
-          </w:p>
-        </w:tc>
-        <w:tc>
-          <w:tcPr>
-            <w:tcW w:type="dxa" w:w="900"/>
-            <w:tcBorders>
-              <w:top w:val="single" w:color="D1D5DB" w:sz="4"/>
-              <w:left w:val="single" w:color="D1D5DB" w:sz="4"/>
-              <w:bottom w:val="single" w:color="D1D5DB" w:sz="4"/>
-              <w:right w:val="single" w:color="D1D5DB" w:sz="4"/>
-            </w:tcBorders>
-            <w:shd w:fill="F3F4F6" w:color="auto" w:val="clear"/>
-            <w:tcMar>
-              <w:top w:type="dxa" w:w="70"/>
-              <w:left w:type="dxa" w:w="100"/>
-              <w:bottom w:type="dxa" w:w="70"/>
-              <w:right w:type="dxa" w:w="100"/>
-            </w:tcMar>
-          </w:tcPr>
-          <w:p>
-            <w:pPr>
-              <w:spacing w:after="30"/>
-            </w:pPr>
-            <w:r>
-              <w:rPr>
-                <w:rFonts w:ascii="Arial" w:cs="Arial" w:eastAsia="Arial" w:hAnsi="Arial"/>
-                <w:b w:val="false"/>
-                <w:bCs w:val="false"/>
-                <w:color w:val="1F2933"/>
-                <w:sz w:val="18"/>
-                <w:szCs w:val="18"/>
-              </w:rPr>
-              <w:t xml:space="preserve">MUST</w:t>
-            </w:r>
-          </w:p>
-        </w:tc>
-      </w:tr>
-      <w:tr>
-        <w:trPr>
-          <w:cantSplit/>
-        </w:trPr>
-        <w:tc>
-          <w:tcPr>
-            <w:tcW w:type="dxa" w:w="3000"/>
-            <w:tcBorders>
-              <w:top w:val="single" w:color="D1D5DB" w:sz="4"/>
-              <w:left w:val="single" w:color="D1D5DB" w:sz="4"/>
-              <w:bottom w:val="single" w:color="D1D5DB" w:sz="4"/>
-              <w:right w:val="single" w:color="D1D5DB" w:sz="4"/>
-            </w:tcBorders>
-            <w:tcMar>
-              <w:top w:type="dxa" w:w="70"/>
-              <w:left w:type="dxa" w:w="100"/>
-              <w:bottom w:type="dxa" w:w="70"/>
-              <w:right w:type="dxa" w:w="100"/>
-            </w:tcMar>
-          </w:tcPr>
-          <w:p>
-            <w:pPr>
-              <w:spacing w:after="30"/>
-            </w:pPr>
-            <w:r>
-              <w:rPr>
-                <w:rFonts w:ascii="Arial" w:cs="Arial" w:eastAsia="Arial" w:hAnsi="Arial"/>
-                <w:b w:val="false"/>
-                <w:bCs w:val="false"/>
-                <w:color w:val="1F2933"/>
-                <w:sz w:val="18"/>
-                <w:szCs w:val="18"/>
-              </w:rPr>
-              <w:t xml:space="preserve">Any title or thumbnail changes after publish, with dates</w:t>
-            </w:r>
-          </w:p>
-        </w:tc>
-        <w:tc>
-          <w:tcPr>
-            <w:tcW w:type="dxa" w:w="2900"/>
-            <w:tcBorders>
-              <w:top w:val="single" w:color="D1D5DB" w:sz="4"/>
-              <w:left w:val="single" w:color="D1D5DB" w:sz="4"/>
-              <w:bottom w:val="single" w:color="D1D5DB" w:sz="4"/>
-              <w:right w:val="single" w:color="D1D5DB" w:sz="4"/>
-            </w:tcBorders>
-            <w:tcMar>
-              <w:top w:type="dxa" w:w="70"/>
-              <w:left w:type="dxa" w:w="100"/>
-              <w:bottom w:type="dxa" w:w="70"/>
-              <w:right w:type="dxa" w:w="100"/>
-            </w:tcMar>
-          </w:tcPr>
-          <w:p>
-            <w:pPr>
-              <w:spacing w:after="30"/>
-            </w:pPr>
-            <w:r>
-              <w:rPr>
-                <w:rFonts w:ascii="Arial" w:cs="Arial" w:eastAsia="Arial" w:hAnsi="Arial"/>
-                <w:b w:val="false"/>
-                <w:bCs w:val="false"/>
-                <w:color w:val="1F2933"/>
-                <w:sz w:val="18"/>
-                <w:szCs w:val="18"/>
-              </w:rPr>
-              <w:t xml:space="preserve">Team memory / change log</w:t>
-            </w:r>
-          </w:p>
-        </w:tc>
-        <w:tc>
-          <w:tcPr>
-            <w:tcW w:type="dxa" w:w="2560"/>
-            <w:tcBorders>
-              <w:top w:val="single" w:color="D1D5DB" w:sz="4"/>
-              <w:left w:val="single" w:color="D1D5DB" w:sz="4"/>
-              <w:bottom w:val="single" w:color="D1D5DB" w:sz="4"/>
-              <w:right w:val="single" w:color="D1D5DB" w:sz="4"/>
-            </w:tcBorders>
-            <w:tcMar>
-              <w:top w:type="dxa" w:w="70"/>
-              <w:left w:type="dxa" w:w="100"/>
-              <w:bottom w:type="dxa" w:w="70"/>
-              <w:right w:type="dxa" w:w="100"/>
-            </w:tcMar>
-          </w:tcPr>
-          <w:p>
-            <w:pPr>
-              <w:spacing w:after="30"/>
-            </w:pPr>
-            <w:r>
-              <w:rPr>
-                <w:rFonts w:ascii="Arial" w:cs="Arial" w:eastAsia="Arial" w:hAnsi="Arial"/>
-                <w:b w:val="false"/>
-                <w:bCs w:val="false"/>
-                <w:color w:val="1F2933"/>
-                <w:sz w:val="18"/>
-                <w:szCs w:val="18"/>
-              </w:rPr>
-              <w:t xml:space="preserve">Sheet</w:t>
-            </w:r>
-          </w:p>
-        </w:tc>
-        <w:tc>
-          <w:tcPr>
-            <w:tcW w:type="dxa" w:w="900"/>
-            <w:tcBorders>
-              <w:top w:val="single" w:color="D1D5DB" w:sz="4"/>
-              <w:left w:val="single" w:color="D1D5DB" w:sz="4"/>
-              <w:bottom w:val="single" w:color="D1D5DB" w:sz="4"/>
-              <w:right w:val="single" w:color="D1D5DB" w:sz="4"/>
-            </w:tcBorders>
-            <w:tcMar>
-              <w:top w:type="dxa" w:w="70"/>
-              <w:left w:type="dxa" w:w="100"/>
-              <w:bottom w:type="dxa" w:w="70"/>
-              <w:right w:type="dxa" w:w="100"/>
-            </w:tcMar>
-          </w:tcPr>
-          <w:p>
-            <w:pPr>
-              <w:spacing w:after="30"/>
-            </w:pPr>
-            <w:r>
-              <w:rPr>
-                <w:rFonts w:ascii="Arial" w:cs="Arial" w:eastAsia="Arial" w:hAnsi="Arial"/>
-                <w:b w:val="false"/>
-                <w:bCs w:val="false"/>
-                <w:color w:val="1F2933"/>
-                <w:sz w:val="18"/>
-                <w:szCs w:val="18"/>
-              </w:rPr>
-              <w:t xml:space="preserve">HIGH</w:t>
             </w:r>
           </w:p>
         </w:tc>
@@ -5096,7 +4887,7 @@
           <w:sz w:val="24"/>
           <w:szCs w:val="24"/>
         </w:rPr>
-        <w:t xml:space="preserve">1G. Shorts</w:t>
+        <w:t xml:space="preserve">1G. Community</w:t>
       </w:r>
     </w:p>
     <w:tbl>
@@ -5291,7 +5082,7 @@
                 <w:sz w:val="18"/>
                 <w:szCs w:val="18"/>
               </w:rPr>
-              <w:t xml:space="preserve">Per Short: views, engaged views, "viewed vs swiped away" (stayed to watch), average percentage viewed, subscribers gained</w:t>
+              <w:t xml:space="preserve">Community tab post performance, if used</w:t>
             </w:r>
           </w:p>
         </w:tc>
@@ -5324,7 +5115,7 @@
                 <w:sz w:val="18"/>
                 <w:szCs w:val="18"/>
               </w:rPr>
-              <w:t xml:space="preserve">Content → Shorts → each Short → Analytics, or Advanced mode filtered to Shorts</w:t>
+              <w:t xml:space="preserve">Analytics → Content → Posts</w:t>
             </w:r>
           </w:p>
         </w:tc>
@@ -5357,7 +5148,7 @@
                 <w:sz w:val="18"/>
                 <w:szCs w:val="18"/>
               </w:rPr>
-              <w:t xml:space="preserve">CSV / Sheet</w:t>
+              <w:t xml:space="preserve">Screenshot</w:t>
             </w:r>
           </w:p>
         </w:tc>
@@ -5390,7 +5181,7 @@
                 <w:sz w:val="18"/>
                 <w:szCs w:val="18"/>
               </w:rPr>
-              <w:t xml:space="preserve">HIGH</w:t>
+              <w:t xml:space="preserve">NICE</w:t>
             </w:r>
           </w:p>
         </w:tc>
@@ -5429,7 +5220,7 @@
                 <w:sz w:val="18"/>
                 <w:szCs w:val="18"/>
               </w:rPr>
-              <w:t xml:space="preserve">Which long-form episode each Short came from</w:t>
+              <w:t xml:space="preserve">End screen and card click-through rates</w:t>
             </w:r>
           </w:p>
         </w:tc>
@@ -5463,7 +5254,7 @@
                 <w:sz w:val="18"/>
                 <w:szCs w:val="18"/>
               </w:rPr>
-              <w:t xml:space="preserve">Team knowledge</w:t>
+              <w:t xml:space="preserve">Advanced mode → End screen elements / Cards</w:t>
             </w:r>
           </w:p>
         </w:tc>
@@ -5497,7 +5288,7 @@
                 <w:sz w:val="18"/>
                 <w:szCs w:val="18"/>
               </w:rPr>
-              <w:t xml:space="preserve">Sheet column</w:t>
+              <w:t xml:space="preserve">CSV / Sheet</w:t>
             </w:r>
           </w:p>
         </w:tc>
@@ -5511,598 +5302,6 @@
               <w:right w:val="single" w:color="D1D5DB" w:sz="4"/>
             </w:tcBorders>
             <w:shd w:fill="F3F4F6" w:color="auto" w:val="clear"/>
-            <w:tcMar>
-              <w:top w:type="dxa" w:w="70"/>
-              <w:left w:type="dxa" w:w="100"/>
-              <w:bottom w:type="dxa" w:w="70"/>
-              <w:right w:type="dxa" w:w="100"/>
-            </w:tcMar>
-          </w:tcPr>
-          <w:p>
-            <w:pPr>
-              <w:spacing w:after="30"/>
-            </w:pPr>
-            <w:r>
-              <w:rPr>
-                <w:rFonts w:ascii="Arial" w:cs="Arial" w:eastAsia="Arial" w:hAnsi="Arial"/>
-                <w:b w:val="false"/>
-                <w:bCs w:val="false"/>
-                <w:color w:val="1F2933"/>
-                <w:sz w:val="18"/>
-                <w:szCs w:val="18"/>
-              </w:rPr>
-              <w:t xml:space="preserve">HIGH</w:t>
-            </w:r>
-          </w:p>
-        </w:tc>
-      </w:tr>
-    </w:tbl>
-    <w:p>
-      <w:pPr>
-        <w:pStyle w:val="Heading2"/>
-        <w:spacing w:after="100" w:before="260"/>
-      </w:pPr>
-      <w:r>
-        <w:rPr>
-          <w:rFonts w:ascii="Arial" w:cs="Arial" w:eastAsia="Arial" w:hAnsi="Arial"/>
-          <w:b/>
-          <w:bCs/>
-          <w:color w:val="C8102E"/>
-          <w:sz w:val="24"/>
-          <w:szCs w:val="24"/>
-        </w:rPr>
-        <w:t xml:space="preserve">1H. Comments and community</w:t>
-      </w:r>
-    </w:p>
-    <w:tbl>
-      <w:tblPr>
-        <w:tblW w:type="dxa" w:w="9360"/>
-        <w:tblBorders>
-          <w:top w:val="single" w:color="auto" w:sz="4"/>
-          <w:left w:val="single" w:color="auto" w:sz="4"/>
-          <w:bottom w:val="single" w:color="auto" w:sz="4"/>
-          <w:right w:val="single" w:color="auto" w:sz="4"/>
-          <w:insideH w:val="single" w:color="auto" w:sz="4"/>
-          <w:insideV w:val="single" w:color="auto" w:sz="4"/>
-        </w:tblBorders>
-      </w:tblPr>
-      <w:tblGrid>
-        <w:gridCol w:w="3000"/>
-        <w:gridCol w:w="2900"/>
-        <w:gridCol w:w="2560"/>
-        <w:gridCol w:w="900"/>
-      </w:tblGrid>
-      <w:tr>
-        <w:trPr>
-          <w:tblHeader/>
-        </w:trPr>
-        <w:tc>
-          <w:tcPr>
-            <w:tcW w:type="dxa" w:w="3000"/>
-            <w:tcBorders>
-              <w:top w:val="single" w:color="D1D5DB" w:sz="4"/>
-              <w:left w:val="single" w:color="D1D5DB" w:sz="4"/>
-              <w:bottom w:val="single" w:color="D1D5DB" w:sz="4"/>
-              <w:right w:val="single" w:color="D1D5DB" w:sz="4"/>
-            </w:tcBorders>
-            <w:shd w:fill="1F2933" w:color="auto" w:val="clear"/>
-            <w:tcMar>
-              <w:top w:type="dxa" w:w="70"/>
-              <w:left w:type="dxa" w:w="100"/>
-              <w:bottom w:type="dxa" w:w="70"/>
-              <w:right w:type="dxa" w:w="100"/>
-            </w:tcMar>
-          </w:tcPr>
-          <w:p>
-            <w:pPr>
-              <w:spacing w:after="30"/>
-            </w:pPr>
-            <w:r>
-              <w:rPr>
-                <w:rFonts w:ascii="Arial" w:cs="Arial" w:eastAsia="Arial" w:hAnsi="Arial"/>
-                <w:b/>
-                <w:bCs/>
-                <w:color w:val="FFFFFF"/>
-                <w:sz w:val="18"/>
-                <w:szCs w:val="18"/>
-              </w:rPr>
-              <w:t xml:space="preserve">What</w:t>
-            </w:r>
-          </w:p>
-        </w:tc>
-        <w:tc>
-          <w:tcPr>
-            <w:tcW w:type="dxa" w:w="2900"/>
-            <w:tcBorders>
-              <w:top w:val="single" w:color="D1D5DB" w:sz="4"/>
-              <w:left w:val="single" w:color="D1D5DB" w:sz="4"/>
-              <w:bottom w:val="single" w:color="D1D5DB" w:sz="4"/>
-              <w:right w:val="single" w:color="D1D5DB" w:sz="4"/>
-            </w:tcBorders>
-            <w:shd w:fill="1F2933" w:color="auto" w:val="clear"/>
-            <w:tcMar>
-              <w:top w:type="dxa" w:w="70"/>
-              <w:left w:type="dxa" w:w="100"/>
-              <w:bottom w:type="dxa" w:w="70"/>
-              <w:right w:type="dxa" w:w="100"/>
-            </w:tcMar>
-          </w:tcPr>
-          <w:p>
-            <w:pPr>
-              <w:spacing w:after="30"/>
-            </w:pPr>
-            <w:r>
-              <w:rPr>
-                <w:rFonts w:ascii="Arial" w:cs="Arial" w:eastAsia="Arial" w:hAnsi="Arial"/>
-                <w:b/>
-                <w:bCs/>
-                <w:color w:val="FFFFFF"/>
-                <w:sz w:val="18"/>
-                <w:szCs w:val="18"/>
-              </w:rPr>
-              <w:t xml:space="preserve">Where to find it</w:t>
-            </w:r>
-          </w:p>
-        </w:tc>
-        <w:tc>
-          <w:tcPr>
-            <w:tcW w:type="dxa" w:w="2560"/>
-            <w:tcBorders>
-              <w:top w:val="single" w:color="D1D5DB" w:sz="4"/>
-              <w:left w:val="single" w:color="D1D5DB" w:sz="4"/>
-              <w:bottom w:val="single" w:color="D1D5DB" w:sz="4"/>
-              <w:right w:val="single" w:color="D1D5DB" w:sz="4"/>
-            </w:tcBorders>
-            <w:shd w:fill="1F2933" w:color="auto" w:val="clear"/>
-            <w:tcMar>
-              <w:top w:type="dxa" w:w="70"/>
-              <w:left w:type="dxa" w:w="100"/>
-              <w:bottom w:type="dxa" w:w="70"/>
-              <w:right w:type="dxa" w:w="100"/>
-            </w:tcMar>
-          </w:tcPr>
-          <w:p>
-            <w:pPr>
-              <w:spacing w:after="30"/>
-            </w:pPr>
-            <w:r>
-              <w:rPr>
-                <w:rFonts w:ascii="Arial" w:cs="Arial" w:eastAsia="Arial" w:hAnsi="Arial"/>
-                <w:b/>
-                <w:bCs/>
-                <w:color w:val="FFFFFF"/>
-                <w:sz w:val="18"/>
-                <w:szCs w:val="18"/>
-              </w:rPr>
-              <w:t xml:space="preserve">Format</w:t>
-            </w:r>
-          </w:p>
-        </w:tc>
-        <w:tc>
-          <w:tcPr>
-            <w:tcW w:type="dxa" w:w="900"/>
-            <w:tcBorders>
-              <w:top w:val="single" w:color="D1D5DB" w:sz="4"/>
-              <w:left w:val="single" w:color="D1D5DB" w:sz="4"/>
-              <w:bottom w:val="single" w:color="D1D5DB" w:sz="4"/>
-              <w:right w:val="single" w:color="D1D5DB" w:sz="4"/>
-            </w:tcBorders>
-            <w:shd w:fill="1F2933" w:color="auto" w:val="clear"/>
-            <w:tcMar>
-              <w:top w:type="dxa" w:w="70"/>
-              <w:left w:type="dxa" w:w="100"/>
-              <w:bottom w:type="dxa" w:w="70"/>
-              <w:right w:type="dxa" w:w="100"/>
-            </w:tcMar>
-          </w:tcPr>
-          <w:p>
-            <w:pPr>
-              <w:spacing w:after="30"/>
-            </w:pPr>
-            <w:r>
-              <w:rPr>
-                <w:rFonts w:ascii="Arial" w:cs="Arial" w:eastAsia="Arial" w:hAnsi="Arial"/>
-                <w:b/>
-                <w:bCs/>
-                <w:color w:val="FFFFFF"/>
-                <w:sz w:val="18"/>
-                <w:szCs w:val="18"/>
-              </w:rPr>
-              <w:t xml:space="preserve">Priority</w:t>
-            </w:r>
-          </w:p>
-        </w:tc>
-      </w:tr>
-      <w:tr>
-        <w:trPr>
-          <w:cantSplit/>
-        </w:trPr>
-        <w:tc>
-          <w:tcPr>
-            <w:tcW w:type="dxa" w:w="3000"/>
-            <w:tcBorders>
-              <w:top w:val="single" w:color="D1D5DB" w:sz="4"/>
-              <w:left w:val="single" w:color="D1D5DB" w:sz="4"/>
-              <w:bottom w:val="single" w:color="D1D5DB" w:sz="4"/>
-              <w:right w:val="single" w:color="D1D5DB" w:sz="4"/>
-            </w:tcBorders>
-            <w:tcMar>
-              <w:top w:type="dxa" w:w="70"/>
-              <w:left w:type="dxa" w:w="100"/>
-              <w:bottom w:type="dxa" w:w="70"/>
-              <w:right w:type="dxa" w:w="100"/>
-            </w:tcMar>
-          </w:tcPr>
-          <w:p>
-            <w:pPr>
-              <w:spacing w:after="30"/>
-            </w:pPr>
-            <w:r>
-              <w:rPr>
-                <w:rFonts w:ascii="Arial" w:cs="Arial" w:eastAsia="Arial" w:hAnsi="Arial"/>
-                <w:b w:val="false"/>
-                <w:bCs w:val="false"/>
-                <w:color w:val="1F2933"/>
-                <w:sz w:val="18"/>
-                <w:szCs w:val="18"/>
-              </w:rPr>
-              <w:t xml:space="preserve">Top comments on the 10 best and 10 worst episodes (what viewers praise, complain about, correct us on)</w:t>
-            </w:r>
-          </w:p>
-        </w:tc>
-        <w:tc>
-          <w:tcPr>
-            <w:tcW w:type="dxa" w:w="2900"/>
-            <w:tcBorders>
-              <w:top w:val="single" w:color="D1D5DB" w:sz="4"/>
-              <w:left w:val="single" w:color="D1D5DB" w:sz="4"/>
-              <w:bottom w:val="single" w:color="D1D5DB" w:sz="4"/>
-              <w:right w:val="single" w:color="D1D5DB" w:sz="4"/>
-            </w:tcBorders>
-            <w:tcMar>
-              <w:top w:type="dxa" w:w="70"/>
-              <w:left w:type="dxa" w:w="100"/>
-              <w:bottom w:type="dxa" w:w="70"/>
-              <w:right w:type="dxa" w:w="100"/>
-            </w:tcMar>
-          </w:tcPr>
-          <w:p>
-            <w:pPr>
-              <w:spacing w:after="30"/>
-            </w:pPr>
-            <w:r>
-              <w:rPr>
-                <w:rFonts w:ascii="Arial" w:cs="Arial" w:eastAsia="Arial" w:hAnsi="Arial"/>
-                <w:b w:val="false"/>
-                <w:bCs w:val="false"/>
-                <w:color w:val="1F2933"/>
-                <w:sz w:val="18"/>
-                <w:szCs w:val="18"/>
-              </w:rPr>
-              <w:t xml:space="preserve">Studio → Comments, or a comment-export tool</w:t>
-            </w:r>
-          </w:p>
-        </w:tc>
-        <w:tc>
-          <w:tcPr>
-            <w:tcW w:type="dxa" w:w="2560"/>
-            <w:tcBorders>
-              <w:top w:val="single" w:color="D1D5DB" w:sz="4"/>
-              <w:left w:val="single" w:color="D1D5DB" w:sz="4"/>
-              <w:bottom w:val="single" w:color="D1D5DB" w:sz="4"/>
-              <w:right w:val="single" w:color="D1D5DB" w:sz="4"/>
-            </w:tcBorders>
-            <w:tcMar>
-              <w:top w:type="dxa" w:w="70"/>
-              <w:left w:type="dxa" w:w="100"/>
-              <w:bottom w:type="dxa" w:w="70"/>
-              <w:right w:type="dxa" w:w="100"/>
-            </w:tcMar>
-          </w:tcPr>
-          <w:p>
-            <w:pPr>
-              <w:spacing w:after="30"/>
-            </w:pPr>
-            <w:r>
-              <w:rPr>
-                <w:rFonts w:ascii="Arial" w:cs="Arial" w:eastAsia="Arial" w:hAnsi="Arial"/>
-                <w:b w:val="false"/>
-                <w:bCs w:val="false"/>
-                <w:color w:val="1F2933"/>
-                <w:sz w:val="18"/>
-                <w:szCs w:val="18"/>
-              </w:rPr>
-              <w:t xml:space="preserve">CSV / text</w:t>
-            </w:r>
-          </w:p>
-        </w:tc>
-        <w:tc>
-          <w:tcPr>
-            <w:tcW w:type="dxa" w:w="900"/>
-            <w:tcBorders>
-              <w:top w:val="single" w:color="D1D5DB" w:sz="4"/>
-              <w:left w:val="single" w:color="D1D5DB" w:sz="4"/>
-              <w:bottom w:val="single" w:color="D1D5DB" w:sz="4"/>
-              <w:right w:val="single" w:color="D1D5DB" w:sz="4"/>
-            </w:tcBorders>
-            <w:tcMar>
-              <w:top w:type="dxa" w:w="70"/>
-              <w:left w:type="dxa" w:w="100"/>
-              <w:bottom w:type="dxa" w:w="70"/>
-              <w:right w:type="dxa" w:w="100"/>
-            </w:tcMar>
-          </w:tcPr>
-          <w:p>
-            <w:pPr>
-              <w:spacing w:after="30"/>
-            </w:pPr>
-            <w:r>
-              <w:rPr>
-                <w:rFonts w:ascii="Arial" w:cs="Arial" w:eastAsia="Arial" w:hAnsi="Arial"/>
-                <w:b w:val="false"/>
-                <w:bCs w:val="false"/>
-                <w:color w:val="1F2933"/>
-                <w:sz w:val="18"/>
-                <w:szCs w:val="18"/>
-              </w:rPr>
-              <w:t xml:space="preserve">HIGH</w:t>
-            </w:r>
-          </w:p>
-        </w:tc>
-      </w:tr>
-      <w:tr>
-        <w:trPr>
-          <w:cantSplit/>
-        </w:trPr>
-        <w:tc>
-          <w:tcPr>
-            <w:tcW w:type="dxa" w:w="3000"/>
-            <w:tcBorders>
-              <w:top w:val="single" w:color="D1D5DB" w:sz="4"/>
-              <w:left w:val="single" w:color="D1D5DB" w:sz="4"/>
-              <w:bottom w:val="single" w:color="D1D5DB" w:sz="4"/>
-              <w:right w:val="single" w:color="D1D5DB" w:sz="4"/>
-            </w:tcBorders>
-            <w:shd w:fill="F3F4F6" w:color="auto" w:val="clear"/>
-            <w:tcMar>
-              <w:top w:type="dxa" w:w="70"/>
-              <w:left w:type="dxa" w:w="100"/>
-              <w:bottom w:type="dxa" w:w="70"/>
-              <w:right w:type="dxa" w:w="100"/>
-            </w:tcMar>
-          </w:tcPr>
-          <w:p>
-            <w:pPr>
-              <w:spacing w:after="30"/>
-            </w:pPr>
-            <w:r>
-              <w:rPr>
-                <w:rFonts w:ascii="Arial" w:cs="Arial" w:eastAsia="Arial" w:hAnsi="Arial"/>
-                <w:b w:val="false"/>
-                <w:bCs w:val="false"/>
-                <w:color w:val="1F2933"/>
-                <w:sz w:val="18"/>
-                <w:szCs w:val="18"/>
-              </w:rPr>
-              <w:t xml:space="preserve">Community tab post performance, if used</w:t>
-            </w:r>
-          </w:p>
-        </w:tc>
-        <w:tc>
-          <w:tcPr>
-            <w:tcW w:type="dxa" w:w="2900"/>
-            <w:tcBorders>
-              <w:top w:val="single" w:color="D1D5DB" w:sz="4"/>
-              <w:left w:val="single" w:color="D1D5DB" w:sz="4"/>
-              <w:bottom w:val="single" w:color="D1D5DB" w:sz="4"/>
-              <w:right w:val="single" w:color="D1D5DB" w:sz="4"/>
-            </w:tcBorders>
-            <w:shd w:fill="F3F4F6" w:color="auto" w:val="clear"/>
-            <w:tcMar>
-              <w:top w:type="dxa" w:w="70"/>
-              <w:left w:type="dxa" w:w="100"/>
-              <w:bottom w:type="dxa" w:w="70"/>
-              <w:right w:type="dxa" w:w="100"/>
-            </w:tcMar>
-          </w:tcPr>
-          <w:p>
-            <w:pPr>
-              <w:spacing w:after="30"/>
-            </w:pPr>
-            <w:r>
-              <w:rPr>
-                <w:rFonts w:ascii="Arial" w:cs="Arial" w:eastAsia="Arial" w:hAnsi="Arial"/>
-                <w:b w:val="false"/>
-                <w:bCs w:val="false"/>
-                <w:color w:val="1F2933"/>
-                <w:sz w:val="18"/>
-                <w:szCs w:val="18"/>
-              </w:rPr>
-              <w:t xml:space="preserve">Analytics → Content → Posts</w:t>
-            </w:r>
-          </w:p>
-        </w:tc>
-        <w:tc>
-          <w:tcPr>
-            <w:tcW w:type="dxa" w:w="2560"/>
-            <w:tcBorders>
-              <w:top w:val="single" w:color="D1D5DB" w:sz="4"/>
-              <w:left w:val="single" w:color="D1D5DB" w:sz="4"/>
-              <w:bottom w:val="single" w:color="D1D5DB" w:sz="4"/>
-              <w:right w:val="single" w:color="D1D5DB" w:sz="4"/>
-            </w:tcBorders>
-            <w:shd w:fill="F3F4F6" w:color="auto" w:val="clear"/>
-            <w:tcMar>
-              <w:top w:type="dxa" w:w="70"/>
-              <w:left w:type="dxa" w:w="100"/>
-              <w:bottom w:type="dxa" w:w="70"/>
-              <w:right w:type="dxa" w:w="100"/>
-            </w:tcMar>
-          </w:tcPr>
-          <w:p>
-            <w:pPr>
-              <w:spacing w:after="30"/>
-            </w:pPr>
-            <w:r>
-              <w:rPr>
-                <w:rFonts w:ascii="Arial" w:cs="Arial" w:eastAsia="Arial" w:hAnsi="Arial"/>
-                <w:b w:val="false"/>
-                <w:bCs w:val="false"/>
-                <w:color w:val="1F2933"/>
-                <w:sz w:val="18"/>
-                <w:szCs w:val="18"/>
-              </w:rPr>
-              <w:t xml:space="preserve">Screenshot</w:t>
-            </w:r>
-          </w:p>
-        </w:tc>
-        <w:tc>
-          <w:tcPr>
-            <w:tcW w:type="dxa" w:w="900"/>
-            <w:tcBorders>
-              <w:top w:val="single" w:color="D1D5DB" w:sz="4"/>
-              <w:left w:val="single" w:color="D1D5DB" w:sz="4"/>
-              <w:bottom w:val="single" w:color="D1D5DB" w:sz="4"/>
-              <w:right w:val="single" w:color="D1D5DB" w:sz="4"/>
-            </w:tcBorders>
-            <w:shd w:fill="F3F4F6" w:color="auto" w:val="clear"/>
-            <w:tcMar>
-              <w:top w:type="dxa" w:w="70"/>
-              <w:left w:type="dxa" w:w="100"/>
-              <w:bottom w:type="dxa" w:w="70"/>
-              <w:right w:type="dxa" w:w="100"/>
-            </w:tcMar>
-          </w:tcPr>
-          <w:p>
-            <w:pPr>
-              <w:spacing w:after="30"/>
-            </w:pPr>
-            <w:r>
-              <w:rPr>
-                <w:rFonts w:ascii="Arial" w:cs="Arial" w:eastAsia="Arial" w:hAnsi="Arial"/>
-                <w:b w:val="false"/>
-                <w:bCs w:val="false"/>
-                <w:color w:val="1F2933"/>
-                <w:sz w:val="18"/>
-                <w:szCs w:val="18"/>
-              </w:rPr>
-              <w:t xml:space="preserve">NICE</w:t>
-            </w:r>
-          </w:p>
-        </w:tc>
-      </w:tr>
-      <w:tr>
-        <w:trPr>
-          <w:cantSplit/>
-        </w:trPr>
-        <w:tc>
-          <w:tcPr>
-            <w:tcW w:type="dxa" w:w="3000"/>
-            <w:tcBorders>
-              <w:top w:val="single" w:color="D1D5DB" w:sz="4"/>
-              <w:left w:val="single" w:color="D1D5DB" w:sz="4"/>
-              <w:bottom w:val="single" w:color="D1D5DB" w:sz="4"/>
-              <w:right w:val="single" w:color="D1D5DB" w:sz="4"/>
-            </w:tcBorders>
-            <w:tcMar>
-              <w:top w:type="dxa" w:w="70"/>
-              <w:left w:type="dxa" w:w="100"/>
-              <w:bottom w:type="dxa" w:w="70"/>
-              <w:right w:type="dxa" w:w="100"/>
-            </w:tcMar>
-          </w:tcPr>
-          <w:p>
-            <w:pPr>
-              <w:spacing w:after="30"/>
-            </w:pPr>
-            <w:r>
-              <w:rPr>
-                <w:rFonts w:ascii="Arial" w:cs="Arial" w:eastAsia="Arial" w:hAnsi="Arial"/>
-                <w:b w:val="false"/>
-                <w:bCs w:val="false"/>
-                <w:color w:val="1F2933"/>
-                <w:sz w:val="18"/>
-                <w:szCs w:val="18"/>
-              </w:rPr>
-              <w:t xml:space="preserve">End screen and card click-through rates</w:t>
-            </w:r>
-          </w:p>
-        </w:tc>
-        <w:tc>
-          <w:tcPr>
-            <w:tcW w:type="dxa" w:w="2900"/>
-            <w:tcBorders>
-              <w:top w:val="single" w:color="D1D5DB" w:sz="4"/>
-              <w:left w:val="single" w:color="D1D5DB" w:sz="4"/>
-              <w:bottom w:val="single" w:color="D1D5DB" w:sz="4"/>
-              <w:right w:val="single" w:color="D1D5DB" w:sz="4"/>
-            </w:tcBorders>
-            <w:tcMar>
-              <w:top w:type="dxa" w:w="70"/>
-              <w:left w:type="dxa" w:w="100"/>
-              <w:bottom w:type="dxa" w:w="70"/>
-              <w:right w:type="dxa" w:w="100"/>
-            </w:tcMar>
-          </w:tcPr>
-          <w:p>
-            <w:pPr>
-              <w:spacing w:after="30"/>
-            </w:pPr>
-            <w:r>
-              <w:rPr>
-                <w:rFonts w:ascii="Arial" w:cs="Arial" w:eastAsia="Arial" w:hAnsi="Arial"/>
-                <w:b w:val="false"/>
-                <w:bCs w:val="false"/>
-                <w:color w:val="1F2933"/>
-                <w:sz w:val="18"/>
-                <w:szCs w:val="18"/>
-              </w:rPr>
-              <w:t xml:space="preserve">Advanced mode → End screen elements / Cards</w:t>
-            </w:r>
-          </w:p>
-        </w:tc>
-        <w:tc>
-          <w:tcPr>
-            <w:tcW w:type="dxa" w:w="2560"/>
-            <w:tcBorders>
-              <w:top w:val="single" w:color="D1D5DB" w:sz="4"/>
-              <w:left w:val="single" w:color="D1D5DB" w:sz="4"/>
-              <w:bottom w:val="single" w:color="D1D5DB" w:sz="4"/>
-              <w:right w:val="single" w:color="D1D5DB" w:sz="4"/>
-            </w:tcBorders>
-            <w:tcMar>
-              <w:top w:type="dxa" w:w="70"/>
-              <w:left w:type="dxa" w:w="100"/>
-              <w:bottom w:type="dxa" w:w="70"/>
-              <w:right w:type="dxa" w:w="100"/>
-            </w:tcMar>
-          </w:tcPr>
-          <w:p>
-            <w:pPr>
-              <w:spacing w:after="30"/>
-            </w:pPr>
-            <w:r>
-              <w:rPr>
-                <w:rFonts w:ascii="Arial" w:cs="Arial" w:eastAsia="Arial" w:hAnsi="Arial"/>
-                <w:b w:val="false"/>
-                <w:bCs w:val="false"/>
-                <w:color w:val="1F2933"/>
-                <w:sz w:val="18"/>
-                <w:szCs w:val="18"/>
-              </w:rPr>
-              <w:t xml:space="preserve">CSV / Sheet</w:t>
-            </w:r>
-          </w:p>
-        </w:tc>
-        <w:tc>
-          <w:tcPr>
-            <w:tcW w:type="dxa" w:w="900"/>
-            <w:tcBorders>
-              <w:top w:val="single" w:color="D1D5DB" w:sz="4"/>
-              <w:left w:val="single" w:color="D1D5DB" w:sz="4"/>
-              <w:bottom w:val="single" w:color="D1D5DB" w:sz="4"/>
-              <w:right w:val="single" w:color="D1D5DB" w:sz="4"/>
-            </w:tcBorders>
             <w:tcMar>
               <w:top w:type="dxa" w:w="70"/>
               <w:left w:type="dxa" w:w="100"/>
@@ -6652,7 +5851,7 @@
                 <w:sz w:val="18"/>
                 <w:szCs w:val="18"/>
               </w:rPr>
-              <w:t xml:space="preserve">Whether each post was native upload, crosspost, live, or a link to YouTube</w:t>
+              <w:t xml:space="preserve">What each post is: the full live show, a crosspost of the YouTube video, a different edit, or a clip</w:t>
             </w:r>
           </w:p>
         </w:tc>
@@ -6751,7 +5950,7 @@
                 <w:sz w:val="18"/>
                 <w:szCs w:val="18"/>
               </w:rPr>
-              <w:t xml:space="preserve">HIGH</w:t>
+              <w:t xml:space="preserve">MUST</w:t>
             </w:r>
           </w:p>
         </w:tc>
@@ -6966,7 +6165,7 @@
                 <w:sz w:val="18"/>
                 <w:szCs w:val="18"/>
               </w:rPr>
-              <w:t xml:space="preserve">Audience retention graph for the last 30 videos (or top and bottom 10)</w:t>
+              <w:t xml:space="preserve">Audience retention graph for the last 30 videos (or 20 spread across high and low views)</w:t>
             </w:r>
           </w:p>
         </w:tc>
@@ -8536,143 +7735,6 @@
           </w:p>
         </w:tc>
       </w:tr>
-      <w:tr>
-        <w:trPr>
-          <w:cantSplit/>
-        </w:trPr>
-        <w:tc>
-          <w:tcPr>
-            <w:tcW w:type="dxa" w:w="3000"/>
-            <w:tcBorders>
-              <w:top w:val="single" w:color="D1D5DB" w:sz="4"/>
-              <w:left w:val="single" w:color="D1D5DB" w:sz="4"/>
-              <w:bottom w:val="single" w:color="D1D5DB" w:sz="4"/>
-              <w:right w:val="single" w:color="D1D5DB" w:sz="4"/>
-            </w:tcBorders>
-            <w:tcMar>
-              <w:top w:type="dxa" w:w="70"/>
-              <w:left w:type="dxa" w:w="100"/>
-              <w:bottom w:type="dxa" w:w="70"/>
-              <w:right w:type="dxa" w:w="100"/>
-            </w:tcMar>
-          </w:tcPr>
-          <w:p>
-            <w:pPr>
-              <w:spacing w:after="30"/>
-            </w:pPr>
-            <w:r>
-              <w:rPr>
-                <w:rFonts w:ascii="Arial" w:cs="Arial" w:eastAsia="Arial" w:hAnsi="Arial"/>
-                <w:b w:val="false"/>
-                <w:bCs w:val="false"/>
-                <w:color w:val="1F2933"/>
-                <w:sz w:val="18"/>
-                <w:szCs w:val="18"/>
-              </w:rPr>
-              <w:t xml:space="preserve">Top comments on best and worst videos</w:t>
-            </w:r>
-          </w:p>
-        </w:tc>
-        <w:tc>
-          <w:tcPr>
-            <w:tcW w:type="dxa" w:w="2900"/>
-            <w:tcBorders>
-              <w:top w:val="single" w:color="D1D5DB" w:sz="4"/>
-              <w:left w:val="single" w:color="D1D5DB" w:sz="4"/>
-              <w:bottom w:val="single" w:color="D1D5DB" w:sz="4"/>
-              <w:right w:val="single" w:color="D1D5DB" w:sz="4"/>
-            </w:tcBorders>
-            <w:tcMar>
-              <w:top w:type="dxa" w:w="70"/>
-              <w:left w:type="dxa" w:w="100"/>
-              <w:bottom w:type="dxa" w:w="70"/>
-              <w:right w:type="dxa" w:w="100"/>
-            </w:tcMar>
-          </w:tcPr>
-          <w:p>
-            <w:pPr>
-              <w:spacing w:after="30"/>
-            </w:pPr>
-            <w:r>
-              <w:rPr>
-                <w:rFonts w:ascii="Arial" w:cs="Arial" w:eastAsia="Arial" w:hAnsi="Arial"/>
-                <w:b w:val="false"/>
-                <w:bCs w:val="false"/>
-                <w:color w:val="1F2933"/>
-                <w:sz w:val="18"/>
-                <w:szCs w:val="18"/>
-              </w:rPr>
-              <w:t xml:space="preserve">Each post</w:t>
-            </w:r>
-          </w:p>
-        </w:tc>
-        <w:tc>
-          <w:tcPr>
-            <w:tcW w:type="dxa" w:w="2560"/>
-            <w:tcBorders>
-              <w:top w:val="single" w:color="D1D5DB" w:sz="4"/>
-              <w:left w:val="single" w:color="D1D5DB" w:sz="4"/>
-              <w:bottom w:val="single" w:color="D1D5DB" w:sz="4"/>
-              <w:right w:val="single" w:color="D1D5DB" w:sz="4"/>
-            </w:tcBorders>
-            <w:tcMar>
-              <w:top w:type="dxa" w:w="70"/>
-              <w:left w:type="dxa" w:w="100"/>
-              <w:bottom w:type="dxa" w:w="70"/>
-              <w:right w:type="dxa" w:w="100"/>
-            </w:tcMar>
-          </w:tcPr>
-          <w:p>
-            <w:pPr>
-              <w:spacing w:after="30"/>
-            </w:pPr>
-            <w:r>
-              <w:rPr>
-                <w:rFonts w:ascii="Arial" w:cs="Arial" w:eastAsia="Arial" w:hAnsi="Arial"/>
-                <w:b w:val="false"/>
-                <w:bCs w:val="false"/>
-                <w:color w:val="1F2933"/>
-                <w:sz w:val="18"/>
-                <w:szCs w:val="18"/>
-              </w:rPr>
-              <w:t xml:space="preserve">Text</w:t>
-            </w:r>
-          </w:p>
-        </w:tc>
-        <w:tc>
-          <w:tcPr>
-            <w:tcW w:type="dxa" w:w="900"/>
-            <w:tcBorders>
-              <w:top w:val="single" w:color="D1D5DB" w:sz="4"/>
-              <w:left w:val="single" w:color="D1D5DB" w:sz="4"/>
-              <w:bottom w:val="single" w:color="D1D5DB" w:sz="4"/>
-              <w:right w:val="single" w:color="D1D5DB" w:sz="4"/>
-            </w:tcBorders>
-            <w:tcMar>
-              <w:top w:type="dxa" w:w="70"/>
-              <w:left w:type="dxa" w:w="100"/>
-              <w:bottom w:type="dxa" w:w="70"/>
-              <w:right w:type="dxa" w:w="100"/>
-            </w:tcMar>
-          </w:tcPr>
-          <w:p>
-            <w:pPr>
-              <w:spacing w:after="30"/>
-            </w:pPr>
-            <w:r>
-              <w:rPr>
-                <w:rFonts w:ascii="Arial" w:cs="Arial" w:eastAsia="Arial" w:hAnsi="Arial"/>
-                <w:b w:val="false"/>
-                <w:bCs w:val="false"/>
-                <w:color w:val="1F2933"/>
-                <w:sz w:val="18"/>
-                <w:szCs w:val="18"/>
-              </w:rPr>
-              <w:t xml:space="preserve">NICE</w:t>
-            </w:r>
-          </w:p>
-        </w:tc>
-      </w:tr>
     </w:tbl>
     <w:p>
       <w:r>
@@ -8707,7 +7769,7 @@
           <w:sz w:val="21"/>
           <w:szCs w:val="21"/>
         </w:rPr>
-        <w:t xml:space="preserve">The platform numbers only become useful when each video is matched to what we made. Most of this already exists somewhere; it just needs to be in one sheet.</w:t>
+        <w:t xml:space="preserve">The platform numbers only become useful when each video is matched to what we made. We'll do most of this matching ourselves.</w:t>
       </w:r>
     </w:p>
     <w:tbl>
@@ -8902,7 +7964,7 @@
                 <w:sz w:val="18"/>
                 <w:szCs w:val="18"/>
               </w:rPr>
-              <w:t xml:space="preserve">Episode map: air date, F1/F2/call-in, YouTube URL, Facebook URL, bible file, A/B/C story topics, guest, sponsor(s)</w:t>
+              <w:t xml:space="preserve">Corrections to our draft episode map (air date, F1/F2/call-in, YouTube URL, stories, guest, sponsor), plus the Facebook URL for each show</w:t>
             </w:r>
           </w:p>
         </w:tc>
@@ -8935,7 +7997,7 @@
                 <w:sz w:val="18"/>
                 <w:szCs w:val="18"/>
               </w:rPr>
-              <w:t xml:space="preserve">Release calendar + Topic Assignments sheet + bibles</w:t>
+              <w:t xml:space="preserve">We'll send the draft</w:t>
             </w:r>
           </w:p>
         </w:tc>
@@ -8968,7 +8030,7 @@
                 <w:sz w:val="18"/>
                 <w:szCs w:val="18"/>
               </w:rPr>
-              <w:t xml:space="preserve">One sheet</w:t>
+              <w:t xml:space="preserve">Edits in the sheet</w:t>
             </w:r>
           </w:p>
         </w:tc>
@@ -9040,7 +8102,7 @@
                 <w:sz w:val="18"/>
                 <w:szCs w:val="18"/>
               </w:rPr>
-              <w:t xml:space="preserve">Segment timestamps per episode (see 1B)</w:t>
+              <w:t xml:space="preserve">Matt's August 2026 back-catalog teardown (the source sheet behind the channel facts)</w:t>
             </w:r>
           </w:p>
         </w:tc>
@@ -9074,7 +8136,7 @@
                 <w:sz w:val="18"/>
                 <w:szCs w:val="18"/>
               </w:rPr>
-              <w:t xml:space="preserve">Editor / chapters / rundown</w:t>
+              <w:t xml:space="preserve">Matt</w:t>
             </w:r>
           </w:p>
         </w:tc>
@@ -9108,7 +8170,7 @@
                 <w:sz w:val="18"/>
                 <w:szCs w:val="18"/>
               </w:rPr>
-              <w:t xml:space="preserve">Sheet</w:t>
+              <w:t xml:space="preserve">Sheet / link</w:t>
             </w:r>
           </w:p>
         </w:tc>
@@ -9142,7 +8204,7 @@
                 <w:sz w:val="18"/>
                 <w:szCs w:val="18"/>
               </w:rPr>
-              <w:t xml:space="preserve">MUST</w:t>
+              <w:t xml:space="preserve">HIGH</w:t>
             </w:r>
           </w:p>
         </w:tc>
@@ -9180,7 +8242,7 @@
                 <w:sz w:val="18"/>
                 <w:szCs w:val="18"/>
               </w:rPr>
-              <w:t xml:space="preserve">The final bible as aired (or as sent to Jeff) for each of the 30 episodes</w:t>
+              <w:t xml:space="preserve">Notes after each show from Jeff, Ryan, Matt (emails or docs)</w:t>
             </w:r>
           </w:p>
         </w:tc>
@@ -9213,7 +8275,7 @@
                 <w:sz w:val="18"/>
                 <w:szCs w:val="18"/>
               </w:rPr>
-              <w:t xml:space="preserve">Show folders in Drive</w:t>
+              <w:t xml:space="preserve">Inbox / Drive</w:t>
             </w:r>
           </w:p>
         </w:tc>
@@ -9246,7 +8308,7 @@
                 <w:sz w:val="18"/>
                 <w:szCs w:val="18"/>
               </w:rPr>
-              <w:t xml:space="preserve">Drive links</w:t>
+              <w:t xml:space="preserve">Forward or link</w:t>
             </w:r>
           </w:p>
         </w:tc>
@@ -9318,7 +8380,7 @@
                 <w:sz w:val="18"/>
                 <w:szCs w:val="18"/>
               </w:rPr>
-              <w:t xml:space="preserve">Notes after each show from Jeff, Ryan, Matt (emails or docs)</w:t>
+              <w:t xml:space="preserve">Thumbnail and title options that were considered but not used</w:t>
             </w:r>
           </w:p>
         </w:tc>
@@ -9352,7 +8414,7 @@
                 <w:sz w:val="18"/>
                 <w:szCs w:val="18"/>
               </w:rPr>
-              <w:t xml:space="preserve">Inbox / Drive</w:t>
+              <w:t xml:space="preserve">Design / producer files</w:t>
             </w:r>
           </w:p>
         </w:tc>
@@ -9386,7 +8448,7 @@
                 <w:sz w:val="18"/>
                 <w:szCs w:val="18"/>
               </w:rPr>
-              <w:t xml:space="preserve">Forward or link</w:t>
+              <w:t xml:space="preserve">Images / sheet</w:t>
             </w:r>
           </w:p>
         </w:tc>
@@ -9420,7 +8482,7 @@
                 <w:sz w:val="18"/>
                 <w:szCs w:val="18"/>
               </w:rPr>
-              <w:t xml:space="preserve">HIGH</w:t>
+              <w:t xml:space="preserve">NICE</w:t>
             </w:r>
           </w:p>
         </w:tc>
@@ -9458,7 +8520,7 @@
                 <w:sz w:val="18"/>
                 <w:szCs w:val="18"/>
               </w:rPr>
-              <w:t xml:space="preserve">Thumbnail and title options that were considered but not used</w:t>
+              <w:t xml:space="preserve">Newsletter or other promotion per episode, if any</w:t>
             </w:r>
           </w:p>
         </w:tc>
@@ -9491,7 +8553,7 @@
                 <w:sz w:val="18"/>
                 <w:szCs w:val="18"/>
               </w:rPr>
-              <w:t xml:space="preserve">Design / producer files</w:t>
+              <w:t xml:space="preserve">Marketing</w:t>
             </w:r>
           </w:p>
         </w:tc>
@@ -9524,7 +8586,7 @@
                 <w:sz w:val="18"/>
                 <w:szCs w:val="18"/>
               </w:rPr>
-              <w:t xml:space="preserve">Images / sheet</w:t>
+              <w:t xml:space="preserve">Sheet</w:t>
             </w:r>
           </w:p>
         </w:tc>
@@ -9537,147 +8599,6 @@
               <w:bottom w:val="single" w:color="D1D5DB" w:sz="4"/>
               <w:right w:val="single" w:color="D1D5DB" w:sz="4"/>
             </w:tcBorders>
-            <w:tcMar>
-              <w:top w:type="dxa" w:w="70"/>
-              <w:left w:type="dxa" w:w="100"/>
-              <w:bottom w:type="dxa" w:w="70"/>
-              <w:right w:type="dxa" w:w="100"/>
-            </w:tcMar>
-          </w:tcPr>
-          <w:p>
-            <w:pPr>
-              <w:spacing w:after="30"/>
-            </w:pPr>
-            <w:r>
-              <w:rPr>
-                <w:rFonts w:ascii="Arial" w:cs="Arial" w:eastAsia="Arial" w:hAnsi="Arial"/>
-                <w:b w:val="false"/>
-                <w:bCs w:val="false"/>
-                <w:color w:val="1F2933"/>
-                <w:sz w:val="18"/>
-                <w:szCs w:val="18"/>
-              </w:rPr>
-              <w:t xml:space="preserve">NICE</w:t>
-            </w:r>
-          </w:p>
-        </w:tc>
-      </w:tr>
-      <w:tr>
-        <w:trPr>
-          <w:cantSplit/>
-        </w:trPr>
-        <w:tc>
-          <w:tcPr>
-            <w:tcW w:type="dxa" w:w="3000"/>
-            <w:tcBorders>
-              <w:top w:val="single" w:color="D1D5DB" w:sz="4"/>
-              <w:left w:val="single" w:color="D1D5DB" w:sz="4"/>
-              <w:bottom w:val="single" w:color="D1D5DB" w:sz="4"/>
-              <w:right w:val="single" w:color="D1D5DB" w:sz="4"/>
-            </w:tcBorders>
-            <w:shd w:fill="F3F4F6" w:color="auto" w:val="clear"/>
-            <w:tcMar>
-              <w:top w:type="dxa" w:w="70"/>
-              <w:left w:type="dxa" w:w="100"/>
-              <w:bottom w:type="dxa" w:w="70"/>
-              <w:right w:type="dxa" w:w="100"/>
-            </w:tcMar>
-          </w:tcPr>
-          <w:p>
-            <w:pPr>
-              <w:spacing w:after="30"/>
-            </w:pPr>
-            <w:r>
-              <w:rPr>
-                <w:rFonts w:ascii="Arial" w:cs="Arial" w:eastAsia="Arial" w:hAnsi="Arial"/>
-                <w:b w:val="false"/>
-                <w:bCs w:val="false"/>
-                <w:color w:val="1F2933"/>
-                <w:sz w:val="18"/>
-                <w:szCs w:val="18"/>
-              </w:rPr>
-              <w:t xml:space="preserve">Newsletter or other promotion per episode, if any</w:t>
-            </w:r>
-          </w:p>
-        </w:tc>
-        <w:tc>
-          <w:tcPr>
-            <w:tcW w:type="dxa" w:w="2900"/>
-            <w:tcBorders>
-              <w:top w:val="single" w:color="D1D5DB" w:sz="4"/>
-              <w:left w:val="single" w:color="D1D5DB" w:sz="4"/>
-              <w:bottom w:val="single" w:color="D1D5DB" w:sz="4"/>
-              <w:right w:val="single" w:color="D1D5DB" w:sz="4"/>
-            </w:tcBorders>
-            <w:shd w:fill="F3F4F6" w:color="auto" w:val="clear"/>
-            <w:tcMar>
-              <w:top w:type="dxa" w:w="70"/>
-              <w:left w:type="dxa" w:w="100"/>
-              <w:bottom w:type="dxa" w:w="70"/>
-              <w:right w:type="dxa" w:w="100"/>
-            </w:tcMar>
-          </w:tcPr>
-          <w:p>
-            <w:pPr>
-              <w:spacing w:after="30"/>
-            </w:pPr>
-            <w:r>
-              <w:rPr>
-                <w:rFonts w:ascii="Arial" w:cs="Arial" w:eastAsia="Arial" w:hAnsi="Arial"/>
-                <w:b w:val="false"/>
-                <w:bCs w:val="false"/>
-                <w:color w:val="1F2933"/>
-                <w:sz w:val="18"/>
-                <w:szCs w:val="18"/>
-              </w:rPr>
-              <w:t xml:space="preserve">Marketing</w:t>
-            </w:r>
-          </w:p>
-        </w:tc>
-        <w:tc>
-          <w:tcPr>
-            <w:tcW w:type="dxa" w:w="2560"/>
-            <w:tcBorders>
-              <w:top w:val="single" w:color="D1D5DB" w:sz="4"/>
-              <w:left w:val="single" w:color="D1D5DB" w:sz="4"/>
-              <w:bottom w:val="single" w:color="D1D5DB" w:sz="4"/>
-              <w:right w:val="single" w:color="D1D5DB" w:sz="4"/>
-            </w:tcBorders>
-            <w:shd w:fill="F3F4F6" w:color="auto" w:val="clear"/>
-            <w:tcMar>
-              <w:top w:type="dxa" w:w="70"/>
-              <w:left w:type="dxa" w:w="100"/>
-              <w:bottom w:type="dxa" w:w="70"/>
-              <w:right w:type="dxa" w:w="100"/>
-            </w:tcMar>
-          </w:tcPr>
-          <w:p>
-            <w:pPr>
-              <w:spacing w:after="30"/>
-            </w:pPr>
-            <w:r>
-              <w:rPr>
-                <w:rFonts w:ascii="Arial" w:cs="Arial" w:eastAsia="Arial" w:hAnsi="Arial"/>
-                <w:b w:val="false"/>
-                <w:bCs w:val="false"/>
-                <w:color w:val="1F2933"/>
-                <w:sz w:val="18"/>
-                <w:szCs w:val="18"/>
-              </w:rPr>
-              <w:t xml:space="preserve">Sheet</w:t>
-            </w:r>
-          </w:p>
-        </w:tc>
-        <w:tc>
-          <w:tcPr>
-            <w:tcW w:type="dxa" w:w="900"/>
-            <w:tcBorders>
-              <w:top w:val="single" w:color="D1D5DB" w:sz="4"/>
-              <w:left w:val="single" w:color="D1D5DB" w:sz="4"/>
-              <w:bottom w:val="single" w:color="D1D5DB" w:sz="4"/>
-              <w:right w:val="single" w:color="D1D5DB" w:sz="4"/>
-            </w:tcBorders>
-            <w:shd w:fill="F3F4F6" w:color="auto" w:val="clear"/>
             <w:tcMar>
               <w:top w:type="dxa" w:w="70"/>
               <w:left w:type="dxa" w:w="100"/>
@@ -9718,7 +8639,7 @@
           <w:sz w:val="30"/>
           <w:szCs w:val="30"/>
         </w:rPr>
-        <w:t xml:space="preserve">4. Ongoing access (instead of exports, if easier)</w:t>
+        <w:t xml:space="preserve">4. Read-only access (saves the most work)</w:t>
       </w:r>
     </w:p>
     <w:p>
@@ -9732,7 +8653,7 @@
           <w:sz w:val="21"/>
           <w:szCs w:val="21"/>
         </w:rPr>
-        <w:t xml:space="preserve">A one-time pull is enough to start. If we want this every week without anyone exporting by hand, read-only access is cleaner:</w:t>
+        <w:t xml:space="preserve">This saves the most work. With read-only access, nobody has to take retention screenshots (1B), now or each week:</w:t>
       </w:r>
     </w:p>
     <w:p>
@@ -9856,7 +8777,7 @@
           <w:sz w:val="21"/>
           <w:szCs w:val="21"/>
         </w:rPr>
-        <w:t xml:space="preserve">YouTube per-video export (1A), last 30 episodes.</w:t>
+        <w:t xml:space="preserve">YouTube per-video export (1A), live shows and uploads separated, last 12 months.</w:t>
       </w:r>
     </w:p>
     <w:p>
@@ -9875,7 +8796,7 @@
           <w:sz w:val="21"/>
           <w:szCs w:val="21"/>
         </w:rPr>
-        <w:t xml:space="preserve">YouTube retention screenshots for the 10 best and 10 worst episodes (1B).</w:t>
+        <w:t xml:space="preserve">Retention: API access (section 4), or screenshots for 20 shows spread across show types (1B), plus the Key moments panel.</w:t>
       </w:r>
     </w:p>
     <w:p>
@@ -9894,7 +8815,7 @@
           <w:sz w:val="21"/>
           <w:szCs w:val="21"/>
         </w:rPr>
-        <w:t xml:space="preserve">Segment timestamps for those same 20 episodes (1B).</w:t>
+        <w:t xml:space="preserve">Title and thumbnail changes after publish (1C).</w:t>
       </w:r>
     </w:p>
     <w:p>
@@ -9913,7 +8834,7 @@
           <w:sz w:val="21"/>
           <w:szCs w:val="21"/>
         </w:rPr>
-        <w:t xml:space="preserve">Titles and thumbnails for those 20 (1C).</w:t>
+        <w:t xml:space="preserve">Facebook per-video export (2A), with what each post is (full show, crosspost, edit or clip).</w:t>
       </w:r>
     </w:p>
     <w:p>
@@ -9932,7 +8853,7 @@
           <w:sz w:val="21"/>
           <w:szCs w:val="21"/>
         </w:rPr>
-        <w:t xml:space="preserve">Facebook per-video export (2A), last 30 videos.</w:t>
+        <w:t xml:space="preserve">Corrections to our draft episode map, with Facebook URLs (section 3).</w:t>
       </w:r>
     </w:p>
     <w:sectPr>
@@ -9943,6 +8864,10 @@
     </w:sectPr>
   </w:body>
 </w:document>
+</file>
+
+<file path=word/comments.xml><?xml version="1.0" encoding="utf-8"?>
+<w:comments xmlns:cx="http://schemas.microsoft.com/office/drawing/2014/chartex" xmlns:cx1="http://schemas.microsoft.com/office/drawing/2015/9/8/chartex" xmlns:cx2="http://schemas.microsoft.com/office/drawing/2015/10/21/chartex" xmlns:cx3="http://schemas.microsoft.com/office/drawing/2016/5/9/chartex" xmlns:cx4="http://schemas.microsoft.com/office/drawing/2016/5/10/chartex" xmlns:cx5="http://schemas.microsoft.com/office/drawing/2016/5/11/chartex" xmlns:cx6="http://schemas.microsoft.com/office/drawing/2016/5/12/chartex" xmlns:cx7="http://schemas.microsoft.com/office/drawing/2016/5/13/chartex" xmlns:cx8="http://schemas.microsoft.com/office/drawing/2016/5/14/chartex" xmlns:mc="http://schemas.openxmlformats.org/markup-compatibility/2006" xmlns:aink="http://schemas.microsoft.com/office/drawing/2016/ink" xmlns:am3d="http://schemas.microsoft.com/office/drawing/2017/model3d" xmlns:o="urn:schemas-microsoft-com:office:office" xmlns:r="http://schemas.openxmlformats.org/officeDocument/2006/relationships" xmlns:m="http://schemas.openxmlformats.org/officeDocument/2006/math" xmlns:v="urn:schemas-microsoft-com:vml" xmlns:wp14="http://schemas.microsoft.com/office/word/2010/wordprocessingDrawing" xmlns:wp="http://schemas.openxmlformats.org/drawingml/2006/wordprocessingDrawing" xmlns:w10="urn:schemas-microsoft-com:office:word" xmlns:w="http://schemas.openxmlformats.org/wordprocessingml/2006/main" xmlns:w14="http://schemas.microsoft.com/office/word/2010/wordml" xmlns:w15="http://schemas.microsoft.com/office/word/2012/wordml" xmlns:w16cex="http://schemas.microsoft.com/office/word/2018/wordml/cex" xmlns:w16cid="http://schemas.microsoft.com/office/word/2016/wordml/cid" xmlns:w16="http://schemas.microsoft.com/office/word/2018/wordml" xmlns:w16sdtdh="http://schemas.microsoft.com/office/word/2020/wordml/sdtdatahash" xmlns:w16se="http://schemas.microsoft.com/office/word/2015/wordml/symex" xmlns:wpg="http://schemas.microsoft.com/office/word/2010/wordprocessingGroup" xmlns:wpi="http://schemas.microsoft.com/office/word/2010/wordprocessingInk" xmlns:wne="http://schemas.microsoft.com/office/word/2006/wordml" xmlns:wps="http://schemas.microsoft.com/office/word/2010/wordprocessingShape"/>
 </file>
 
 <file path=word/endnotes.xml><?xml version="1.0" encoding="utf-8"?>
@@ -10023,7 +8948,7 @@
 <w:numbering xmlns:wpc="http://schemas.microsoft.com/office/word/2010/wordprocessingCanvas" xmlns:mc="http://schemas.openxmlformats.org/markup-compatibility/2006" xmlns:o="urn:schemas-microsoft-com:office:office" xmlns:r="http://schemas.openxmlformats.org/officeDocument/2006/relationships" xmlns:m="http://schemas.openxmlformats.org/officeDocument/2006/math" xmlns:v="urn:schemas-microsoft-com:vml" xmlns:wp14="http://schemas.microsoft.com/office/word/2010/wordprocessingDrawing" xmlns:wp="http://schemas.openxmlformats.org/drawingml/2006/wordprocessingDrawing" xmlns:w10="urn:schemas-microsoft-com:office:word" xmlns:w="http://schemas.openxmlformats.org/wordprocessingml/2006/main" xmlns:w14="http://schemas.microsoft.com/office/word/2010/wordml" xmlns:w15="http://schemas.microsoft.com/office/word/2012/wordml" xmlns:wpg="http://schemas.microsoft.com/office/word/2010/wordprocessingGroup" xmlns:wpi="http://schemas.microsoft.com/office/word/2010/wordprocessingInk" xmlns:wne="http://schemas.microsoft.com/office/word/2006/wordml" xmlns:wps="http://schemas.microsoft.com/office/word/2010/wordprocessingShape" mc:Ignorable="w14 w15 wp14">
   <w:abstractNum w:abstractNumId="1" w15:restartNumberingAfterBreak="0">
     <w:multiLevelType w:val="hybridMultilevel"/>
-    <w:lvl w:ilvl="0" w:tentative="1">
+    <w:lvl w:ilvl="0" w15:tentative="1">
       <w:start w:val="1"/>
       <w:numFmt w:val="bullet"/>
       <w:lvlText w:val="●"/>
@@ -10032,7 +8957,7 @@
         <w:ind w:left="720" w:hanging="360"/>
       </w:pPr>
     </w:lvl>
-    <w:lvl w:ilvl="1" w:tentative="1">
+    <w:lvl w:ilvl="1" w15:tentative="1">
       <w:start w:val="1"/>
       <w:numFmt w:val="bullet"/>
       <w:lvlText w:val="○"/>
@@ -10041,7 +8966,7 @@
         <w:ind w:left="1440" w:hanging="360"/>
       </w:pPr>
     </w:lvl>
-    <w:lvl w:ilvl="2" w:tentative="1">
+    <w:lvl w:ilvl="2" w15:tentative="1">
       <w:start w:val="1"/>
       <w:numFmt w:val="bullet"/>
       <w:lvlText w:val="■"/>
@@ -10050,7 +8975,7 @@
         <w:ind w:left="2160" w:hanging="360"/>
       </w:pPr>
     </w:lvl>
-    <w:lvl w:ilvl="3" w:tentative="1">
+    <w:lvl w:ilvl="3" w15:tentative="1">
       <w:start w:val="1"/>
       <w:numFmt w:val="bullet"/>
       <w:lvlText w:val="●"/>
@@ -10059,7 +8984,7 @@
         <w:ind w:left="2880" w:hanging="360"/>
       </w:pPr>
     </w:lvl>
-    <w:lvl w:ilvl="4" w:tentative="1">
+    <w:lvl w:ilvl="4" w15:tentative="1">
       <w:start w:val="1"/>
       <w:numFmt w:val="bullet"/>
       <w:lvlText w:val="○"/>
@@ -10068,7 +8993,7 @@
         <w:ind w:left="3600" w:hanging="360"/>
       </w:pPr>
     </w:lvl>
-    <w:lvl w:ilvl="5" w:tentative="1">
+    <w:lvl w:ilvl="5" w15:tentative="1">
       <w:start w:val="1"/>
       <w:numFmt w:val="bullet"/>
       <w:lvlText w:val="■"/>
@@ -10077,7 +9002,7 @@
         <w:ind w:left="4320" w:hanging="360"/>
       </w:pPr>
     </w:lvl>
-    <w:lvl w:ilvl="6" w:tentative="1">
+    <w:lvl w:ilvl="6" w15:tentative="1">
       <w:start w:val="1"/>
       <w:numFmt w:val="bullet"/>
       <w:lvlText w:val="●"/>
@@ -10086,7 +9011,7 @@
         <w:ind w:left="5040" w:hanging="360"/>
       </w:pPr>
     </w:lvl>
-    <w:lvl w:ilvl="7" w:tentative="1">
+    <w:lvl w:ilvl="7" w15:tentative="1">
       <w:start w:val="1"/>
       <w:numFmt w:val="bullet"/>
       <w:lvlText w:val="●"/>
@@ -10095,7 +9020,7 @@
         <w:ind w:left="5760" w:hanging="360"/>
       </w:pPr>
     </w:lvl>
-    <w:lvl w:ilvl="8" w:tentative="1">
+    <w:lvl w:ilvl="8" w15:tentative="1">
       <w:start w:val="1"/>
       <w:numFmt w:val="bullet"/>
       <w:lvlText w:val="●"/>
@@ -10107,7 +9032,7 @@
   </w:abstractNum>
   <w:abstractNum w:abstractNumId="2" w15:restartNumberingAfterBreak="0">
     <w:multiLevelType w:val="hybridMultilevel"/>
-    <w:lvl w:ilvl="0" w:tentative="1">
+    <w:lvl w:ilvl="0" w15:tentative="1">
       <w:start w:val="1"/>
       <w:numFmt w:val="bullet"/>
       <w:lvlText w:val="•"/>
@@ -10144,25 +9069,6 @@
     </w:rPrDefault>
     <w:pPrDefault/>
   </w:docDefaults>
-  <w:style w:type="paragraph" w:styleId="Normal" w:default="1">
-    <w:name w:val="Normal"/>
-    <w:qFormat/>
-  </w:style>
-  <w:style w:type="table" w:styleId="TableNormal" w:default="true">
-    <w:name w:val="Normal Table"/>
-    <w:uiPriority w:val="99"/>
-    <w:semiHidden/>
-    <w:unhideWhenUsed/>
-    <w:tblPr>
-      <w:tblInd w:type="dxa" w:w="0"/>
-      <w:tblCellMar>
-        <w:top w:type="dxa" w:w="0"/>
-        <w:left w:type="dxa" w:w="108"/>
-        <w:bottom w:type="dxa" w:w="0"/>
-        <w:right w:type="dxa" w:w="108"/>
-      </w:tblCellMar>
-    </w:tblPr>
-  </w:style>
   <w:style w:type="paragraph" w:styleId="Title">
     <w:name w:val="Title"/>
     <w:basedOn w:val="Normal"/>
@@ -10335,294 +9241,4 @@
     </w:rPr>
   </w:style>
 </w:styles>
-</file>
-
-<file path=word/theme/theme1.xml><?xml version="1.0" encoding="utf-8"?>
-<a:theme xmlns:a="http://schemas.openxmlformats.org/drawingml/2006/main" name="Office Theme">
-  <a:themeElements>
-    <a:clrScheme name="Office">
-      <a:dk1>
-        <a:sysClr val="windowText" lastClr="000000"/>
-      </a:dk1>
-      <a:lt1>
-        <a:sysClr val="window" lastClr="FFFFFF"/>
-      </a:lt1>
-      <a:dk2>
-        <a:srgbClr val="44546A"/>
-      </a:dk2>
-      <a:lt2>
-        <a:srgbClr val="E7E6E6"/>
-      </a:lt2>
-      <a:accent1>
-        <a:srgbClr val="4472C4"/>
-      </a:accent1>
-      <a:accent2>
-        <a:srgbClr val="ED7D31"/>
-      </a:accent2>
-      <a:accent3>
-        <a:srgbClr val="A5A5A5"/>
-      </a:accent3>
-      <a:accent4>
-        <a:srgbClr val="FFC000"/>
-      </a:accent4>
-      <a:accent5>
-        <a:srgbClr val="5B9BD5"/>
-      </a:accent5>
-      <a:accent6>
-        <a:srgbClr val="70AD47"/>
-      </a:accent6>
-      <a:hlink>
-        <a:srgbClr val="0563C1"/>
-      </a:hlink>
-      <a:folHlink>
-        <a:srgbClr val="954F72"/>
-      </a:folHlink>
-    </a:clrScheme>
-    <a:fontScheme name="Office">
-      <a:majorFont>
-        <a:latin typeface="Calibri Light" panose="020F0302020204030204"/>
-        <a:ea typeface=""/>
-        <a:cs typeface=""/>
-        <a:font script="Jpan" typeface="游ゴシック Light"/>
-        <a:font script="Hang" typeface="맑은 고딕"/>
-        <a:font script="Hans" typeface="等线 Light"/>
-        <a:font script="Hant" typeface="新細明體"/>
-        <a:font script="Arab" typeface="Times New Roman"/>
-        <a:font script="Hebr" typeface="Times New Roman"/>
-        <a:font script="Thai" typeface="Angsana New"/>
-        <a:font script="Ethi" typeface="Nyala"/>
-        <a:font script="Beng" typeface="Vrinda"/>
-        <a:font script="Gujr" typeface="Shruti"/>
-        <a:font script="Khmr" typeface="MoolBoran"/>
-        <a:font script="Knda" typeface="Tunga"/>
-        <a:font script="Guru" typeface="Raavi"/>
-        <a:font script="Cans" typeface="Euphemia"/>
-        <a:font script="Cher" typeface="Plantagenet Cherokee"/>
-        <a:font script="Yiii" typeface="Microsoft Yi Baiti"/>
-        <a:font script="Tibt" typeface="Microsoft Himalaya"/>
-        <a:font script="Thaa" typeface="MV Boli"/>
-        <a:font script="Deva" typeface="Mangal"/>
-        <a:font script="Telu" typeface="Gautami"/>
-        <a:font script="Taml" typeface="Latha"/>
-        <a:font script="Syrc" typeface="Estrangelo Edessa"/>
-        <a:font script="Orya" typeface="Kalinga"/>
-        <a:font script="Mlym" typeface="Kartika"/>
-        <a:font script="Laoo" typeface="DokChampa"/>
-        <a:font script="Sinh" typeface="Iskoola Pota"/>
-        <a:font script="Mong" typeface="Mongolian Baiti"/>
-        <a:font script="Viet" typeface="Times New Roman"/>
-        <a:font script="Uigh" typeface="Microsoft Uighur"/>
-        <a:font script="Geor" typeface="Sylfaen"/>
-        <a:font script="Armn" typeface="Arial"/>
-        <a:font script="Bugi" typeface="Leelawadee UI"/>
-        <a:font script="Bopo" typeface="Microsoft JhengHei"/>
-        <a:font script="Java" typeface="Javanese Text"/>
-        <a:font script="Lisu" typeface="Segoe UI"/>
-        <a:font script="Mymr" typeface="Myanmar Text"/>
-        <a:font script="Nkoo" typeface="Ebrima"/>
-        <a:font script="Olck" typeface="Nirmala UI"/>
-        <a:font script="Osma" typeface="Ebrima"/>
-        <a:font script="Phag" typeface="Phagspa"/>
-        <a:font script="Syrn" typeface="Estrangelo Edessa"/>
-        <a:font script="Syrj" typeface="Estrangelo Edessa"/>
-        <a:font script="Syre" typeface="Estrangelo Edessa"/>
-        <a:font script="Sora" typeface="Nirmala UI"/>
-        <a:font script="Tale" typeface="Microsoft Tai Le"/>
-        <a:font script="Talu" typeface="Microsoft New Tai Lue"/>
-        <a:font script="Tfng" typeface="Ebrima"/>
-      </a:majorFont>
-      <a:minorFont>
-        <a:latin typeface="Calibri" panose="020F0502020204030204"/>
-        <a:ea typeface=""/>
-        <a:cs typeface=""/>
-        <a:font script="Jpan" typeface="游明朝"/>
-        <a:font script="Hang" typeface="맑은 고딕"/>
-        <a:font script="Hans" typeface="等线"/>
-        <a:font script="Hant" typeface="新細明體"/>
-        <a:font script="Arab" typeface="Arial"/>
-        <a:font script="Hebr" typeface="Arial"/>
-        <a:font script="Thai" typeface="Cordia New"/>
-        <a:font script="Ethi" typeface="Nyala"/>
-        <a:font script="Beng" typeface="Vrinda"/>
-        <a:font script="Gujr" typeface="Shruti"/>
-        <a:font script="Khmr" typeface="DaunPenh"/>
-        <a:font script="Knda" typeface="Tunga"/>
-        <a:font script="Guru" typeface="Raavi"/>
-        <a:font script="Cans" typeface="Euphemia"/>
-        <a:font script="Cher" typeface="Plantagenet Cherokee"/>
-        <a:font script="Yiii" typeface="Microsoft Yi Baiti"/>
-        <a:font script="Tibt" typeface="Microsoft Himalaya"/>
-        <a:font script="Thaa" typeface="MV Boli"/>
-        <a:font script="Deva" typeface="Mangal"/>
-        <a:font script="Telu" typeface="Gautami"/>
-        <a:font script="Taml" typeface="Latha"/>
-        <a:font script="Syrc" typeface="Estrangelo Edessa"/>
-        <a:font script="Orya" typeface="Kalinga"/>
-        <a:font script="Mlym" typeface="Kartika"/>
-        <a:font script="Laoo" typeface="DokChampa"/>
-        <a:font script="Sinh" typeface="Iskoola Pota"/>
-        <a:font script="Mong" typeface="Mongolian Baiti"/>
-        <a:font script="Viet" typeface="Arial"/>
-        <a:font script="Uigh" typeface="Microsoft Uighur"/>
-        <a:font script="Geor" typeface="Sylfaen"/>
-        <a:font script="Armn" typeface="Arial"/>
-        <a:font script="Bugi" typeface="Leelawadee UI"/>
-        <a:font script="Bopo" typeface="Microsoft JhengHei"/>
-        <a:font script="Java" typeface="Javanese Text"/>
-        <a:font script="Lisu" typeface="Segoe UI"/>
-        <a:font script="Mymr" typeface="Myanmar Text"/>
-        <a:font script="Nkoo" typeface="Ebrima"/>
-        <a:font script="Olck" typeface="Nirmala UI"/>
-        <a:font script="Osma" typeface="Ebrima"/>
-        <a:font script="Phag" typeface="Phagspa"/>
-        <a:font script="Syrn" typeface="Estrangelo Edessa"/>
-        <a:font script="Syrj" typeface="Estrangelo Edessa"/>
-        <a:font script="Syre" typeface="Estrangelo Edessa"/>
-        <a:font script="Sora" typeface="Nirmala UI"/>
-        <a:font script="Tale" typeface="Microsoft Tai Le"/>
-        <a:font script="Talu" typeface="Microsoft New Tai Lue"/>
-        <a:font script="Tfng" typeface="Ebrima"/>
-      </a:minorFont>
-    </a:fontScheme>
-    <a:fmtScheme name="Office">
-      <a:fillStyleLst>
-        <a:solidFill>
-          <a:schemeClr val="phClr"/>
-        </a:solidFill>
-        <a:gradFill rotWithShape="true">
-          <a:gsLst>
-            <a:gs pos="0">
-              <a:schemeClr val="phClr">
-                <a:lumMod val="110000"/>
-                <a:satMod val="105000"/>
-                <a:tint val="67000"/>
-              </a:schemeClr>
-            </a:gs>
-            <a:gs pos="50000">
-              <a:schemeClr val="phClr">
-                <a:lumMod val="105000"/>
-                <a:satMod val="103000"/>
-                <a:tint val="73000"/>
-              </a:schemeClr>
-            </a:gs>
-            <a:gs pos="100000">
-              <a:schemeClr val="phClr">
-                <a:lumMod val="105000"/>
-                <a:satMod val="109000"/>
-                <a:tint val="81000"/>
-              </a:schemeClr>
-            </a:gs>
-          </a:gsLst>
-          <a:lin ang="5400000" scaled="false"/>
-        </a:gradFill>
-        <a:gradFill rotWithShape="true">
-          <a:gsLst>
-            <a:gs pos="0">
-              <a:schemeClr val="phClr">
-                <a:satMod val="103000"/>
-                <a:lumMod val="102000"/>
-                <a:tint val="94000"/>
-              </a:schemeClr>
-            </a:gs>
-            <a:gs pos="50000">
-              <a:schemeClr val="phClr">
-                <a:satMod val="110000"/>
-                <a:lumMod val="100000"/>
-                <a:shade val="100000"/>
-              </a:schemeClr>
-            </a:gs>
-            <a:gs pos="100000">
-              <a:schemeClr val="phClr">
-                <a:lumMod val="99000"/>
-                <a:satMod val="120000"/>
-                <a:shade val="78000"/>
-              </a:schemeClr>
-            </a:gs>
-          </a:gsLst>
-          <a:lin ang="5400000" scaled="false"/>
-        </a:gradFill>
-      </a:fillStyleLst>
-      <a:lnStyleLst>
-        <a:ln w="6350" cap="flat" cmpd="sng" algn="ctr">
-          <a:solidFill>
-            <a:schemeClr val="phClr"/>
-          </a:solidFill>
-          <a:prstDash val="solid"/>
-          <a:miter lim="800000"/>
-        </a:ln>
-        <a:ln w="12700" cap="flat" cmpd="sng" algn="ctr">
-          <a:solidFill>
-            <a:schemeClr val="phClr"/>
-          </a:solidFill>
-          <a:prstDash val="solid"/>
-          <a:miter lim="800000"/>
-        </a:ln>
-        <a:ln w="19050" cap="flat" cmpd="sng" algn="ctr">
-          <a:solidFill>
-            <a:schemeClr val="phClr"/>
-          </a:solidFill>
-          <a:prstDash val="solid"/>
-          <a:miter lim="800000"/>
-        </a:ln>
-      </a:lnStyleLst>
-      <a:effectStyleLst>
-        <a:effectStyle>
-          <a:effectLst/>
-        </a:effectStyle>
-        <a:effectStyle>
-          <a:effectLst/>
-        </a:effectStyle>
-        <a:effectStyle>
-          <a:effectLst>
-            <a:outerShdw blurRad="57150" dist="19050" dir="5400000" algn="ctr" rotWithShape="false">
-              <a:srgbClr val="000000">
-                <a:alpha val="63000"/>
-              </a:srgbClr>
-            </a:outerShdw>
-          </a:effectLst>
-        </a:effectStyle>
-      </a:effectStyleLst>
-      <a:bgFillStyleLst>
-        <a:solidFill>
-          <a:schemeClr val="phClr"/>
-        </a:solidFill>
-        <a:solidFill>
-          <a:schemeClr val="phClr">
-            <a:tint val="95000"/>
-            <a:satMod val="170000"/>
-          </a:schemeClr>
-        </a:solidFill>
-        <a:gradFill rotWithShape="true">
-          <a:gsLst>
-            <a:gs pos="0">
-              <a:schemeClr val="phClr">
-                <a:tint val="93000"/>
-                <a:satMod val="150000"/>
-                <a:shade val="98000"/>
-                <a:lumMod val="102000"/>
-              </a:schemeClr>
-            </a:gs>
-            <a:gs pos="50000">
-              <a:schemeClr val="phClr">
-                <a:tint val="98000"/>
-                <a:satMod val="130000"/>
-                <a:shade val="90000"/>
-                <a:lumMod val="103000"/>
-              </a:schemeClr>
-            </a:gs>
-            <a:gs pos="100000">
-              <a:schemeClr val="phClr">
-                <a:shade val="63000"/>
-                <a:satMod val="120000"/>
-              </a:schemeClr>
-            </a:gs>
-          </a:gsLst>
-          <a:lin ang="5400000" scaled="false"/>
-        </a:gradFill>
-      </a:bgFillStyleLst>
-    </a:fmtScheme>
-  </a:themeElements>
-  <a:objectDefaults/>
-  <a:extraClrSchemeLst/>
-</a:theme>
 </file>
</xml_diff>

<commit_message>
Team change: Matt Raub replaced by TJ Cooney (CLAUDE.md, plan, data request)
Co-Authored-By: Claude Opus 5.5 <noreply@anthropic.com>
Claude-Session: https://claude.ai/code/session_01VmRatYBunsoj9i1F4m2msf
</commit_message>
<xml_diff>
--- a/docs/Rossen Audience Data Request.docx
+++ b/docs/Rossen Audience Data Request.docx
@@ -76,7 +76,7 @@
           <w:sz w:val="21"/>
           <w:szCs w:val="21"/>
         </w:rPr>
-        <w:t xml:space="preserve">Today the scripts are tuned by notes and instinct: what Jeff, Ryan and Matt flag after the fact. This data lets us tune them to what our own audience actually does. Specifically:</w:t>
+        <w:t xml:space="preserve">Today the scripts are tuned by notes and instinct: what Jeff, Ryan and TJ flag after the fact. This data lets us tune them to what our own audience actually does. Specifically:</w:t>
       </w:r>
     </w:p>
     <w:p>
@@ -8102,7 +8102,7 @@
                 <w:sz w:val="18"/>
                 <w:szCs w:val="18"/>
               </w:rPr>
-              <w:t xml:space="preserve">Matt's August 2026 back-catalog teardown (the source sheet behind the channel facts)</w:t>
+              <w:t xml:space="preserve">The August 2026 back-catalog teardown sheet (the YouTube Studio analysis behind our channel facts), if it's still on file</w:t>
             </w:r>
           </w:p>
         </w:tc>
@@ -8136,7 +8136,7 @@
                 <w:sz w:val="18"/>
                 <w:szCs w:val="18"/>
               </w:rPr>
-              <w:t xml:space="preserve">Matt</w:t>
+              <w:t xml:space="preserve">Content team files / Drive</w:t>
             </w:r>
           </w:p>
         </w:tc>
@@ -8242,7 +8242,7 @@
                 <w:sz w:val="18"/>
                 <w:szCs w:val="18"/>
               </w:rPr>
-              <w:t xml:space="preserve">Notes after each show from Jeff, Ryan, Matt (emails or docs)</w:t>
+              <w:t xml:space="preserve">Notes after each show from Jeff, Ryan, TJ (emails or docs)</w:t>
             </w:r>
           </w:p>
         </w:tc>

</xml_diff>